<commit_message>
docs(template): populate template_masalah with verified data findings, research questions, and visual specifications
</commit_message>
<xml_diff>
--- a/template_masalah.docx
+++ b/template_masalah.docx
@@ -1036,7 +1036,7 @@
     </w:p>
     <w:sectPr>
       <w:pgSz w:h="16838" w:w="11906" w:orient="portrait"/>
-      <w:pgMar w:bottom="1133.8582677165355" w:top="1133.8582677165355" w:left="1133.8582677165355" w:right="1133.8582677165355" w:header="720" w:footer="720"/>
+      <w:pgMar w:bottom="1134" w:top="1134" w:left="1134" w:right="1134" w:header="720" w:footer="720"/>
       <w:pgNumType w:start="1"/>
     </w:sectPr>
   </w:body>
@@ -1521,10 +1521,10 @@
     <w:name w:val="TableNormal"/>
     <w:tblPr>
       <w:tblCellMar>
-        <w:top w:w="100.0" w:type="dxa"/>
-        <w:left w:w="100.0" w:type="dxa"/>
-        <w:bottom w:w="100.0" w:type="dxa"/>
-        <w:right w:w="100.0" w:type="dxa"/>
+        <w:top w:w="100" w:type="dxa"/>
+        <w:left w:w="100" w:type="dxa"/>
+        <w:bottom w:w="100" w:type="dxa"/>
+        <w:right w:w="100" w:type="dxa"/>
       </w:tblCellMar>
     </w:tblPr>
   </w:style>

</xml_diff>